<commit_message>
update Ben Hunt doc: owner knows per-truck P&L but with monthly lag
Co-Authored-By: Claude Sonnet 4.6 <noreply@anthropic.com>
</commit_message>
<xml_diff>
--- a/Ben_Hunt_Dialog_Structure.docx
+++ b/Ben_Hunt_Dialog_Structure.docx
@@ -62,7 +62,7 @@
           <w:color w:val="182133"/>
           <w:sz w:val="22"/>
         </w:rPr>
-        <w:t>Робить місячний P&amp;L по компанії — але не по кожному траку окремо. Виручка є, траки їздять, але грошей чомусь менше ніж має бути. Відчуває що щось не так, але не може назвати конкретно що.</w:t>
+        <w:t>Знає прибуток по кожному траку — але раз на місяць, після закриття. Тобто він бачить що трапилось, а не що відбувається прямо зараз. До моменту як він побачив проблему — місяць вже втрачено.</w:t>
       </w:r>
     </w:p>
     <w:p>
@@ -79,7 +79,7 @@
           <w:color w:val="182133"/>
           <w:sz w:val="22"/>
         </w:rPr>
-        <w:t>"Виручка є, траки їздять, але грошей чомусь менше ніж має бути."</w:t>
+        <w:t>"Цифри є. Але я завжди дивлюсь у дзеркало заднього виду."</w:t>
       </w:r>
     </w:p>
     <w:p>
@@ -93,7 +93,35 @@
           <w:color w:val="6B768C"/>
           <w:sz w:val="22"/>
         </w:rPr>
-        <w:t>Він фінансово грамотний — розуміє P&amp;L, мислить цифрами. Говоримо його мовою.</w:t>
+        <w:t>Він фінансово грамотний — розуміє P&amp;L, мислить цифрами. Його біль не в незнанні, а в запізненні. Говоримо його мовою.</w:t>
+      </w:r>
+    </w:p>
+    <w:p>
+      <w:pPr>
+        <w:spacing w:after="80"/>
+        <w:ind w:left="0"/>
+      </w:pPr>
+      <w:r>
+        <w:rPr>
+          <w:i w:val="0"/>
+          <w:color w:val="0E2B63"/>
+          <w:sz w:val="22"/>
+        </w:rPr>
+        <w:t>Ключовий фрейм болю:</w:t>
+      </w:r>
+    </w:p>
+    <w:p>
+      <w:pPr>
+        <w:spacing w:after="80"/>
+        <w:ind w:left="340"/>
+      </w:pPr>
+      <w:r>
+        <w:rPr>
+          <w:i w:val="0"/>
+          <w:color w:val="182133"/>
+          <w:sz w:val="22"/>
+        </w:rPr>
+        <w:t>Він не сліпий — він завжди запізнілий. Коли він бачить що трак збитковий, він вже втратив 30–45 днів. І так кожен місяць.</w:t>
       </w:r>
     </w:p>
     <w:p>
@@ -172,10 +200,10 @@
       <w:r>
         <w:rPr>
           <w:b/>
-          <w:color w:val="0E2B63"/>
+          <w:color w:val="C89B1A"/>
           <w:sz w:val="24"/>
         </w:rPr>
-        <w:t>Стадія 2 — Відчуває що щось не так  ← ВІН ТУТ</w:t>
+        <w:t>Стадія 2 — Знає проблему, але не може на неї вплинути вчасно  ← ВІН ТУТ</w:t>
       </w:r>
     </w:p>
     <w:p>
@@ -189,7 +217,7 @@
           <w:color w:val="182133"/>
           <w:sz w:val="22"/>
         </w:rPr>
-        <w:t>Є відчуття але немає конкретики. Місячний P&amp;L є, але по траках — ні.</w:t>
+        <w:t>Має місячний P&amp;L по кожному траку. Але дані приходять із запізненням на 30–45 днів. Проблему бачить — керувати нею в моменті не може.</w:t>
       </w:r>
     </w:p>
     <w:p>
@@ -210,7 +238,7 @@
           <w:color w:val="182133"/>
           <w:sz w:val="22"/>
         </w:rPr>
-        <w:t>Питання, які перетворюють відчуття на цифру.</w:t>
+        <w:t>Питання, які показують ціну запізнення в конкретних доларах.</w:t>
       </w:r>
     </w:p>
     <w:p>
@@ -223,7 +251,7 @@
           <w:color w:val="0E2B63"/>
           <w:sz w:val="24"/>
         </w:rPr>
-        <w:t>Стадія 3 — Знає що потрібна аналітика</w:t>
+        <w:t>Стадія 3 — Знає що потрібна оперативна аналітика</w:t>
       </w:r>
     </w:p>
     <w:p>
@@ -237,7 +265,7 @@
           <w:color w:val="182133"/>
           <w:sz w:val="22"/>
         </w:rPr>
-        <w:t>Можливо дивився на TMS, думав про аналітика в штат, розглядав софт.</w:t>
+        <w:t>Можливо думав про аналітика в штат, TMS, дашборди.</w:t>
       </w:r>
     </w:p>
     <w:p>
@@ -258,7 +286,7 @@
           <w:color w:val="182133"/>
           <w:sz w:val="22"/>
         </w:rPr>
-        <w:t>Показуємо що ти не "ще один софт" — ти результат, а не система.</w:t>
+        <w:t>Показуємо що ти не "ще один інструмент" — ти результат, а не система.</w:t>
       </w:r>
     </w:p>
     <w:p>
@@ -396,7 +424,7 @@
           <w:color w:val="182133"/>
           <w:sz w:val="22"/>
         </w:rPr>
-        <w:t>Відкриваєш біль конкретним питанням</w:t>
+        <w:t>Показуєш ціну запізнення — скільки коштує кожен втрачений місяць</w:t>
       </w:r>
     </w:p>
     <w:p>
@@ -417,7 +445,7 @@
           <w:color w:val="182133"/>
           <w:sz w:val="22"/>
         </w:rPr>
-        <w:t>Даєш фрейм: ти знаходиш гроші, а не продаєш систему</w:t>
+        <w:t>Даєш фрейм: ти не продаєш систему — ти даєш видимість прямо зараз</w:t>
       </w:r>
     </w:p>
     <w:p>
@@ -515,12 +543,12 @@
           <w:color w:val="182133"/>
           <w:sz w:val="22"/>
         </w:rPr>
-        <w:t>Він робить місячний P&amp;L — значить фінансово грамотний. Говориш його мовою, не пояснюєш базові речі.</w:t>
+        <w:t>Він робить місячний P&amp;L — значить фінансово грамотний. Говориш його мовою, не пояснюєш базові речі. Його біль — не відсутність даних, а відсутність своєчасних даних.</w:t>
       </w:r>
     </w:p>
     <w:p>
       <w:pPr>
-        <w:spacing w:after="120"/>
+        <w:spacing w:after="140"/>
         <w:ind w:left="170"/>
       </w:pPr>
       <w:r>
@@ -539,25 +567,31 @@
         </w:rPr>
         <w:t>"Я знайду де губляться гроші"</w:t>
       </w:r>
+    </w:p>
+    <w:p>
+      <w:pPr>
+        <w:spacing w:after="120"/>
+        <w:ind w:left="510"/>
+      </w:pPr>
       <w:r>
         <w:rPr>
           <w:b/>
           <w:color w:val="1F4EA3"/>
           <w:sz w:val="22"/>
         </w:rPr>
-        <w:t xml:space="preserve">     А: </w:t>
+        <w:t xml:space="preserve">А: </w:t>
       </w:r>
       <w:r>
         <w:rPr>
           <w:color w:val="182133"/>
           <w:sz w:val="22"/>
         </w:rPr>
-        <w:t>"Ти керуєш 50 траками але не знаєш contribution margin по кожному"</w:t>
+        <w:t>"Ти вже знаєш де губляться — але завжди після того як місяць закритий"</w:t>
       </w:r>
     </w:p>
     <w:p>
       <w:pPr>
-        <w:spacing w:after="120"/>
+        <w:spacing w:after="140"/>
         <w:ind w:left="170"/>
       </w:pPr>
       <w:r>
@@ -576,25 +610,31 @@
         </w:rPr>
         <w:t>"Я консультант"</w:t>
       </w:r>
+    </w:p>
+    <w:p>
+      <w:pPr>
+        <w:spacing w:after="120"/>
+        <w:ind w:left="510"/>
+      </w:pPr>
       <w:r>
         <w:rPr>
           <w:b/>
           <w:color w:val="1F4EA3"/>
           <w:sz w:val="22"/>
         </w:rPr>
-        <w:t xml:space="preserve">     А: </w:t>
+        <w:t xml:space="preserve">А: </w:t>
       </w:r>
       <w:r>
         <w:rPr>
           <w:color w:val="182133"/>
           <w:sz w:val="22"/>
         </w:rPr>
-        <w:t>"Profit architect — я впливаю на цифри в твоєму P&amp;L"</w:t>
+        <w:t>"Profit architect — даю видимість по флоту в момент, а не через місяць"</w:t>
       </w:r>
     </w:p>
     <w:p>
       <w:pPr>
-        <w:spacing w:after="120"/>
+        <w:spacing w:after="140"/>
         <w:ind w:left="170"/>
       </w:pPr>
       <w:r>
@@ -611,22 +651,28 @@
           <w:color w:val="6B768C"/>
           <w:sz w:val="22"/>
         </w:rPr>
-        <w:t>"У тебе є проблема"</w:t>
+        <w:t>"У тебе немає даних"</w:t>
       </w:r>
+    </w:p>
+    <w:p>
+      <w:pPr>
+        <w:spacing w:after="120"/>
+        <w:ind w:left="510"/>
+      </w:pPr>
       <w:r>
         <w:rPr>
           <w:b/>
           <w:color w:val="1F4EA3"/>
           <w:sz w:val="22"/>
         </w:rPr>
-        <w:t xml:space="preserve">     А: </w:t>
+        <w:t xml:space="preserve">А: </w:t>
       </w:r>
       <w:r>
         <w:rPr>
           <w:color w:val="182133"/>
           <w:sz w:val="22"/>
         </w:rPr>
-        <w:t>"У тебе є дані але вони не конвертуються в рішення"</w:t>
+        <w:t>"У тебе є дані, але вони завжди про минуле — ми виправляємо це"</w:t>
       </w:r>
     </w:p>
     <w:p>
@@ -647,7 +693,7 @@
           <w:color w:val="1F4EA3"/>
           <w:sz w:val="30"/>
         </w:rPr>
-        <w:t>Одне головне питання для переходу між стадіями</w:t>
+        <w:t>Головне питання для переходу між стадіями</w:t>
       </w:r>
     </w:p>
     <w:p>
@@ -661,7 +707,7 @@
           <w:color w:val="182133"/>
           <w:sz w:val="22"/>
         </w:rPr>
-        <w:t>Перетворює відчуття на конкретний gap. Він сам приходить до висновку — ти нічого не продаєш.</w:t>
+        <w:t>Не атакуєш те що він не знає — він знає. Атакуєш запізнення.</w:t>
       </w:r>
     </w:p>
     <w:p>
@@ -678,7 +724,7 @@
           <w:color w:val="182133"/>
           <w:sz w:val="22"/>
         </w:rPr>
-        <w:t>"Коли ти дивишся на свій P&amp;L — ти бачиш компанію в цілому. А який з 50 траків зараз тягне весь флот вниз — ти знаєш?"</w:t>
+        <w:t>"Ти знаєш прибуток по кожному траку за минулий місяць. А що відбувається прямо зараз — який трак сьогодні тягне флот вниз — ти знаєш?"</w:t>
       </w:r>
     </w:p>
     <w:p>
@@ -692,7 +738,73 @@
           <w:color w:val="6B768C"/>
           <w:sz w:val="22"/>
         </w:rPr>
-        <w:t>Якщо не знає одразу — він сам відчуває що це проблема. Ти тільки поставив питання.</w:t>
+        <w:t>Він не може відповісти "так". Він сам відчуває gap між тим що знає і тим що відбувається прямо зараз. Ти нічого не продаєш — він сам прийшов до висновку.</w:t>
+      </w:r>
+    </w:p>
+    <w:p>
+      <w:pPr>
+        <w:spacing w:before="40" w:after="40"/>
+        <w:pBdr>
+          <w:bottom w:val="single" w:sz="4" w:space="1" w:color="CCCCCC"/>
+        </w:pBdr>
+      </w:pPr>
+    </w:p>
+    <w:p>
+      <w:pPr>
+        <w:spacing w:before="280" w:after="120"/>
+      </w:pPr>
+      <w:r>
+        <w:rPr>
+          <w:b/>
+          <w:color w:val="1F4EA3"/>
+          <w:sz w:val="30"/>
+        </w:rPr>
+        <w:t>Ціна запізнення — як порахувати в розмові</w:t>
+      </w:r>
+    </w:p>
+    <w:p>
+      <w:pPr>
+        <w:spacing w:after="80"/>
+        <w:ind w:left="0"/>
+      </w:pPr>
+      <w:r>
+        <w:rPr>
+          <w:i w:val="0"/>
+          <w:color w:val="182133"/>
+          <w:sz w:val="22"/>
+        </w:rPr>
+        <w:t>Якщо один збитковий трак з 50 коштує $500/міс — і власник дізнається про це через 30 днів — він вже втратив $500. Наступного місяця те саме.</w:t>
+      </w:r>
+    </w:p>
+    <w:p>
+      <w:pPr>
+        <w:spacing w:after="100"/>
+        <w:ind w:left="567"/>
+        <w:pBdr>
+          <w:left w:val="single" w:sz="6" w:space="12" w:color="1f4ea3"/>
+        </w:pBdr>
+      </w:pPr>
+      <w:r>
+        <w:rPr>
+          <w:i/>
+          <w:color w:val="182133"/>
+          <w:sz w:val="22"/>
+        </w:rPr>
+        <w:t>"Якщо хоча б один з 50 траків зараз їздить в мінус — і ти дізнаєшся про це тільки в кінці місяця — скільки це вже коштує за рік?"</w:t>
+      </w:r>
+    </w:p>
+    <w:p>
+      <w:pPr>
+        <w:spacing w:after="80"/>
+        <w:ind w:left="340"/>
+      </w:pPr>
+      <w:r>
+        <w:rPr>
+          <w:i w:val="0"/>
+          <w:color w:val="0E2B63"/>
+          <w:sz w:val="22"/>
+        </w:rPr>
+        <w:t>$500/міс × 12 = $6,000 на рік з одного трака. При 50 траках — ціна запізнення може бути значно більшою.</w:t>
       </w:r>
     </w:p>
     <w:sectPr>

</xml_diff>